<commit_message>
docs(manual): update JP + EN manuals for changes since 2026-08-03
- FILTER: LP/BP/HP switch + 24dB toggle removed (2026-08-16); now a 4-pole
  ladder lowpass (Cutoff/Q) + new HPF Cutoff (fixed highpass in series).
- MIXER: document Bend Range and Osc Drift.
- Computer keyboard: octave shift F1/F2 -> Z/X (2026-09-02 AW-mode revert).
- DELAY: note the new Sync (tempo-sync) toggle.

Edited via document.xml (single-run paragraphs), XSD-validated, paragraph
count unchanged. .gitattributes: *.docx binary. PDF export is on the user.

Co-Authored-By: Claude Sonnet 5 <noreply@anthropic.com>
</commit_message>
<xml_diff>
--- a/manual/FirstSynth User Manual.docx
+++ b/manual/FirstSynth User Manual.docx
@@ -307,7 +307,7 @@
         <w:rPr>
           <w:sz w:val="21"/>
         </w:rPr>
-        <w:t>In Standalone, you can play notes from your computer keyboard even without a MIDI keyboard (starting at the A key, with white and black keys alternating). Use F1/F2 to shift the octave down/up.</w:t>
+        <w:t>In Standalone, you can play notes from your computer keyboard even without a MIDI keyboard (starting at the A key, with white and black keys alternating). Use Z/X to shift the octave down/up.</w:t>
       </w:r>
     </w:p>
     <w:p>
@@ -431,7 +431,7 @@
         <w:rPr>
           <w:sz w:val="21"/>
         </w:rPr>
-        <w:t>Balances the volume of Osc 1, Osc 2, and Noise.</w:t>
+        <w:t>Balances the volume of Osc 1, Osc 2, and Noise. Bend Range sets the pitch-bend range in semitones (0-12). Osc Drift slowly and randomly drifts each oscillator's pitch, adding analog-style movement and thickness (0 = off).</w:t>
       </w:r>
     </w:p>
     <w:p>
@@ -454,7 +454,7 @@
         <w:rPr>
           <w:sz w:val="21"/>
         </w:rPr>
-        <w:t>Cutoff, Q, filter type (LP-BP-HP), and a 24dB mode, plus Key Follow, which lets the filter open automatically according to the pitch played. FILTER ADSR is the envelope that shapes how the filter opens over time (Env Amount controls how strongly it's applied).</w:t>
+        <w:t>Cutoff and Q control the lowpass filter (a 4-pole ladder filter). HPF Cutoff is the cutoff of a fixed highpass filter placed after it (no resonance). Key Follow lets the filter open automatically according to the pitch played. FILTER ADSR is the envelope that shapes how the filter opens over time (Env Amount controls how strongly it's applied).</w:t>
       </w:r>
     </w:p>
     <w:p>
@@ -731,7 +731,7 @@
         <w:rPr>
           <w:sz w:val="21"/>
         </w:rPr>
-        <w:t>Adds a repeating echo. Enable Ping Pong for the echoes to alternate left/right.</w:t>
+        <w:t>Adds a repeating echo. Enable Ping Pong for the echoes to alternate left/right. Turning on Sync switches Time to a tempo-synced note value.</w:t>
       </w:r>
     </w:p>
     <w:p>

</xml_diff>

<commit_message>
docs(manual): add 'Version 1.00' to the cover page (JP + EN)
Co-Authored-By: Claude Sonnet 5 <noreply@anthropic.com>
</commit_message>
<xml_diff>
--- a/manual/FirstSynth User Manual.docx
+++ b/manual/FirstSynth User Manual.docx
@@ -39,6 +39,18 @@
           <w:sz w:val="22"/>
         </w:rPr>
         <w:t>EASYANDNICE INSTRUMENTS</w:t>
+      </w:r>
+    </w:p>
+    <w:p>
+      <w:pPr>
+        <w:jc w:val="center"/>
+      </w:pPr>
+      <w:r>
+        <w:rPr>
+          <w:color w:val="5A5A5A"/>
+          <w:sz w:val="22"/>
+        </w:rPr>
+        <w:t>Version 1.00</w:t>
       </w:r>
     </w:p>
     <w:p>

</xml_diff>